<commit_message>
Actualizar bitacora de depuración + informacion de fase 3
</commit_message>
<xml_diff>
--- a/docs/informe-bruno.docx
+++ b/docs/informe-bruno.docx
@@ -1673,15 +1673,7 @@
       </w:r>
     </w:p>
     <w:p>
-      <w:pPr>
-        <w:rPr>
-          <w:rFonts w:ascii="Arial" w:hAnsi="Arial" w:eastAsia="Arial" w:cs="Arial"/>
-          <w:noProof w:val="0"/>
-          <w:sz w:val="22"/>
-          <w:szCs w:val="22"/>
-          <w:lang w:val="es-ES"/>
-        </w:rPr>
-      </w:pPr>
+      <w:pPr/>
       <w:r>
         <w:rPr>
           <w:rFonts w:ascii="Arial" w:hAnsi="Arial" w:eastAsia="Arial" w:cs="Arial"/>
@@ -1692,6 +1684,1803 @@
         </w:rPr>
         <w:t>Como resultado, la función encargada de obtener el timestamp fue refactorizada para utilizar las utilidades provistas por esta biblioteca, mejorando la legibilidad del código y reduciendo la complejidad de la implementación.</w:t>
       </w:r>
+    </w:p>
+    <w:p>
+      <w:pPr/>
+      <w:r>
+        <w:rPr>
+          <w:rFonts w:ascii="Arial" w:hAnsi="Arial" w:eastAsia="Arial" w:cs="Arial"/>
+          <w:noProof w:val="0"/>
+          <w:sz w:val="22"/>
+          <w:szCs w:val="22"/>
+          <w:lang w:val="es-ES"/>
+        </w:rPr>
+        <w:t xml:space="preserve">Fuente utilizada para este </w:t>
+      </w:r>
+      <w:r>
+        <w:rPr>
+          <w:rFonts w:ascii="Arial" w:hAnsi="Arial" w:eastAsia="Arial" w:cs="Arial"/>
+          <w:noProof w:val="0"/>
+          <w:sz w:val="22"/>
+          <w:szCs w:val="22"/>
+          <w:lang w:val="es-ES"/>
+        </w:rPr>
+        <w:t>módulo</w:t>
+      </w:r>
+      <w:r>
+        <w:rPr>
+          <w:rFonts w:ascii="Arial" w:hAnsi="Arial" w:eastAsia="Arial" w:cs="Arial"/>
+          <w:noProof w:val="0"/>
+          <w:sz w:val="22"/>
+          <w:szCs w:val="22"/>
+          <w:lang w:val="es-ES"/>
+        </w:rPr>
+        <w:t xml:space="preserve">: </w:t>
+      </w:r>
+      <w:hyperlink r:id="Rff695aee5c07486a">
+        <w:r>
+          <w:rPr>
+            <w:rStyle w:val="Hyperlink"/>
+            <w:noProof w:val="0"/>
+            <w:lang w:val="es-ES"/>
+          </w:rPr>
+          <w:t>Local-time docs</w:t>
+        </w:r>
+      </w:hyperlink>
+    </w:p>
+    <w:p>
+      <w:pPr>
+        <w:rPr>
+          <w:rFonts w:ascii="Arial" w:hAnsi="Arial" w:eastAsia="Arial" w:cs="Arial"/>
+          <w:b w:val="1"/>
+          <w:bCs w:val="1"/>
+          <w:noProof w:val="0"/>
+          <w:sz w:val="22"/>
+          <w:szCs w:val="22"/>
+          <w:lang w:val="es-ES"/>
+        </w:rPr>
+      </w:pPr>
+    </w:p>
+    <w:p>
+      <w:pPr>
+        <w:rPr>
+          <w:rFonts w:ascii="Arial" w:hAnsi="Arial" w:eastAsia="Arial" w:cs="Arial"/>
+          <w:b w:val="1"/>
+          <w:bCs w:val="1"/>
+          <w:noProof w:val="0"/>
+          <w:sz w:val="22"/>
+          <w:szCs w:val="22"/>
+          <w:lang w:val="es-ES"/>
+        </w:rPr>
+      </w:pPr>
+    </w:p>
+    <w:p>
+      <w:pPr>
+        <w:rPr>
+          <w:rFonts w:ascii="Arial" w:hAnsi="Arial" w:eastAsia="Arial" w:cs="Arial"/>
+          <w:b w:val="1"/>
+          <w:bCs w:val="1"/>
+          <w:noProof w:val="0"/>
+          <w:sz w:val="22"/>
+          <w:szCs w:val="22"/>
+          <w:lang w:val="es-ES"/>
+        </w:rPr>
+      </w:pPr>
+    </w:p>
+    <w:p>
+      <w:pPr>
+        <w:rPr>
+          <w:rFonts w:ascii="Arial" w:hAnsi="Arial" w:eastAsia="Arial" w:cs="Arial"/>
+          <w:b w:val="1"/>
+          <w:bCs w:val="1"/>
+          <w:noProof w:val="0"/>
+          <w:sz w:val="22"/>
+          <w:szCs w:val="22"/>
+          <w:lang w:val="es-ES"/>
+        </w:rPr>
+      </w:pPr>
+    </w:p>
+    <w:p>
+      <w:pPr>
+        <w:rPr>
+          <w:rFonts w:ascii="Arial" w:hAnsi="Arial" w:eastAsia="Arial" w:cs="Arial"/>
+          <w:b w:val="1"/>
+          <w:bCs w:val="1"/>
+          <w:noProof w:val="0"/>
+          <w:sz w:val="22"/>
+          <w:szCs w:val="22"/>
+          <w:lang w:val="es-ES"/>
+        </w:rPr>
+      </w:pPr>
+    </w:p>
+    <w:p>
+      <w:pPr/>
+      <w:r>
+        <w:rPr>
+          <w:rFonts w:ascii="Arial" w:hAnsi="Arial" w:eastAsia="Arial" w:cs="Arial"/>
+          <w:b w:val="1"/>
+          <w:bCs w:val="1"/>
+          <w:noProof w:val="0"/>
+          <w:sz w:val="22"/>
+          <w:szCs w:val="22"/>
+          <w:lang w:val="es-ES"/>
+        </w:rPr>
+        <w:t>Error de diseño: anidamiento innecesario de estructuras condicionales</w:t>
+      </w:r>
+    </w:p>
+    <w:p>
+      <w:pPr/>
+      <w:r>
+        <w:rPr>
+          <w:rFonts w:ascii="Arial" w:hAnsi="Arial" w:eastAsia="Arial" w:cs="Arial"/>
+          <w:noProof w:val="0"/>
+          <w:sz w:val="22"/>
+          <w:szCs w:val="22"/>
+          <w:lang w:val="es-ES"/>
+        </w:rPr>
+        <w:t xml:space="preserve">Durante el proceso de migración de la función </w:t>
+      </w:r>
+      <w:r>
+        <w:rPr>
+          <w:rFonts w:ascii="Consolas" w:hAnsi="Consolas" w:eastAsia="Consolas" w:cs="Consolas"/>
+          <w:noProof w:val="0"/>
+          <w:sz w:val="22"/>
+          <w:szCs w:val="22"/>
+          <w:lang w:val="es-ES"/>
+        </w:rPr>
+        <w:t>timer</w:t>
+      </w:r>
+      <w:r>
+        <w:rPr>
+          <w:rFonts w:ascii="Arial" w:hAnsi="Arial" w:eastAsia="Arial" w:cs="Arial"/>
+          <w:noProof w:val="0"/>
+          <w:sz w:val="22"/>
+          <w:szCs w:val="22"/>
+          <w:lang w:val="es-ES"/>
+        </w:rPr>
+        <w:t xml:space="preserve"> a Clojure, se identificó un problema de diseño en su implementación original en Lisp. La función utilizaba una estructura </w:t>
+      </w:r>
+      <w:r>
+        <w:rPr>
+          <w:rFonts w:ascii="Consolas" w:hAnsi="Consolas" w:eastAsia="Consolas" w:cs="Consolas"/>
+          <w:noProof w:val="0"/>
+          <w:sz w:val="22"/>
+          <w:szCs w:val="22"/>
+          <w:lang w:val="es-ES"/>
+        </w:rPr>
+        <w:t>if</w:t>
+      </w:r>
+      <w:r>
+        <w:rPr>
+          <w:rFonts w:ascii="Arial" w:hAnsi="Arial" w:eastAsia="Arial" w:cs="Arial"/>
+          <w:noProof w:val="0"/>
+          <w:sz w:val="22"/>
+          <w:szCs w:val="22"/>
+          <w:lang w:val="es-ES"/>
+        </w:rPr>
+        <w:t xml:space="preserve"> para validar el tipo de dato recibido y, dentro de ella, una estructura </w:t>
+      </w:r>
+      <w:r>
+        <w:rPr>
+          <w:rFonts w:ascii="Consolas" w:hAnsi="Consolas" w:eastAsia="Consolas" w:cs="Consolas"/>
+          <w:noProof w:val="0"/>
+          <w:sz w:val="22"/>
+          <w:szCs w:val="22"/>
+          <w:lang w:val="es-ES"/>
+        </w:rPr>
+        <w:t>cond</w:t>
+      </w:r>
+      <w:r>
+        <w:rPr>
+          <w:rFonts w:ascii="Arial" w:hAnsi="Arial" w:eastAsia="Arial" w:cs="Arial"/>
+          <w:noProof w:val="0"/>
+          <w:sz w:val="22"/>
+          <w:szCs w:val="22"/>
+          <w:lang w:val="es-ES"/>
+        </w:rPr>
+        <w:t xml:space="preserve"> para determinar el estado correspondiente del semáforo. Si bien esta implementación era funcionalmente correcta, implicaba un anidamiento de estructuras condicionales que la cátedra considera una mala práctica de diseño.</w:t>
+      </w:r>
+    </w:p>
+    <w:p>
+      <w:pPr/>
+      <w:r>
+        <w:rPr>
+          <w:rFonts w:ascii="Arial" w:hAnsi="Arial" w:eastAsia="Arial" w:cs="Arial"/>
+          <w:noProof w:val="0"/>
+          <w:sz w:val="22"/>
+          <w:szCs w:val="22"/>
+          <w:lang w:val="es-ES"/>
+        </w:rPr>
+        <w:t xml:space="preserve">La estructura </w:t>
+      </w:r>
+      <w:r>
+        <w:rPr>
+          <w:rFonts w:ascii="Consolas" w:hAnsi="Consolas" w:eastAsia="Consolas" w:cs="Consolas"/>
+          <w:noProof w:val="0"/>
+          <w:sz w:val="22"/>
+          <w:szCs w:val="22"/>
+          <w:lang w:val="es-ES"/>
+        </w:rPr>
+        <w:t>if</w:t>
+      </w:r>
+      <w:r>
+        <w:rPr>
+          <w:rFonts w:ascii="Arial" w:hAnsi="Arial" w:eastAsia="Arial" w:cs="Arial"/>
+          <w:noProof w:val="0"/>
+          <w:sz w:val="22"/>
+          <w:szCs w:val="22"/>
+          <w:lang w:val="es-ES"/>
+        </w:rPr>
+        <w:t xml:space="preserve"> se empleaba para verificar que el parámetro </w:t>
+      </w:r>
+      <w:r>
+        <w:rPr>
+          <w:rFonts w:ascii="Consolas" w:hAnsi="Consolas" w:eastAsia="Consolas" w:cs="Consolas"/>
+          <w:noProof w:val="0"/>
+          <w:sz w:val="22"/>
+          <w:szCs w:val="22"/>
+          <w:lang w:val="es-ES"/>
+        </w:rPr>
+        <w:t>timestamp</w:t>
+      </w:r>
+      <w:r>
+        <w:rPr>
+          <w:rFonts w:ascii="Arial" w:hAnsi="Arial" w:eastAsia="Arial" w:cs="Arial"/>
+          <w:noProof w:val="0"/>
+          <w:sz w:val="22"/>
+          <w:szCs w:val="22"/>
+          <w:lang w:val="es-ES"/>
+        </w:rPr>
+        <w:t xml:space="preserve"> fuera de tipo numérico antes de realizar cálculos con él. Esta validación es necesaria, ya que la función utiliza operaciones aritméticas que provocarían errores si se recibiera un valor de otro tipo.</w:t>
+      </w:r>
+    </w:p>
+    <w:p>
+      <w:pPr>
+        <w:pStyle w:val="Normal"/>
+      </w:pPr>
+      <w:r>
+        <w:drawing>
+          <wp:inline wp14:editId="317BE2DB" wp14:anchorId="34EBC4CB">
+            <wp:extent cx="4054191" cy="3452159"/>
+            <wp:effectExtent l="0" t="0" r="0" b="0"/>
+            <wp:docPr id="667465332" name="drawing"/>
+            <wp:cNvGraphicFramePr>
+              <a:graphicFrameLocks noChangeAspect="1"/>
+            </wp:cNvGraphicFramePr>
+            <a:graphic>
+              <a:graphicData xmlns:a="http://schemas.openxmlformats.org/drawingml/2006/main" uri="http://schemas.openxmlformats.org/drawingml/2006/picture">
+                <pic:pic xmlns:pic="http://schemas.openxmlformats.org/drawingml/2006/picture">
+                  <pic:nvPicPr>
+                    <pic:cNvPr id="667465332" name="Picture 667465332"/>
+                    <pic:cNvPicPr/>
+                  </pic:nvPicPr>
+                  <pic:blipFill>
+                    <a:blip xmlns:r="http://schemas.openxmlformats.org/officeDocument/2006/relationships" r:embed="rId1549513296">
+                      <a:extLst>
+                        <a:ext uri="{28A0092B-C50C-407E-A947-70E740481C1C}">
+                          <a14:useLocalDpi xmlns:a14="http://schemas.microsoft.com/office/drawing/2010/main"/>
+                        </a:ext>
+                      </a:extLst>
+                    </a:blip>
+                    <a:stretch>
+                      <a:fillRect/>
+                    </a:stretch>
+                  </pic:blipFill>
+                  <pic:spPr>
+                    <a:xfrm>
+                      <a:off x="0" y="0"/>
+                      <a:ext cx="4054191" cy="3452159"/>
+                    </a:xfrm>
+                    <a:prstGeom prst="rect">
+                      <a:avLst/>
+                    </a:prstGeom>
+                  </pic:spPr>
+                </pic:pic>
+              </a:graphicData>
+            </a:graphic>
+          </wp:inline>
+        </w:drawing>
+      </w:r>
+    </w:p>
+    <w:p>
+      <w:pPr>
+        <w:pStyle w:val="Normal"/>
+        <w:rPr>
+          <w:rFonts w:ascii="Arial" w:hAnsi="Arial" w:eastAsia="Arial" w:cs="Arial"/>
+        </w:rPr>
+      </w:pPr>
+      <w:r>
+        <w:rPr>
+          <w:rFonts w:ascii="Arial" w:hAnsi="Arial" w:eastAsia="Arial" w:cs="Arial"/>
+        </w:rPr>
+        <w:t xml:space="preserve">Error al llamar a la </w:t>
+      </w:r>
+      <w:r>
+        <w:rPr>
+          <w:rFonts w:ascii="Arial" w:hAnsi="Arial" w:eastAsia="Arial" w:cs="Arial"/>
+        </w:rPr>
+        <w:t>funcion</w:t>
+      </w:r>
+      <w:r>
+        <w:rPr>
+          <w:rFonts w:ascii="Arial" w:hAnsi="Arial" w:eastAsia="Arial" w:cs="Arial"/>
+        </w:rPr>
+        <w:t xml:space="preserve"> sin validar datos.</w:t>
+      </w:r>
+    </w:p>
+    <w:p>
+      <w:pPr/>
+      <w:r>
+        <w:rPr>
+          <w:rFonts w:ascii="Arial" w:hAnsi="Arial" w:eastAsia="Arial" w:cs="Arial"/>
+          <w:noProof w:val="0"/>
+          <w:sz w:val="22"/>
+          <w:szCs w:val="22"/>
+          <w:lang w:val="es-ES"/>
+        </w:rPr>
+        <w:t xml:space="preserve">Para mejorar el diseño de la función y evitar el anidamiento de condicionales, se reemplazó dicha lógica por una estructura </w:t>
+      </w:r>
+      <w:r>
+        <w:rPr>
+          <w:rFonts w:ascii="Consolas" w:hAnsi="Consolas" w:eastAsia="Consolas" w:cs="Consolas"/>
+          <w:noProof w:val="0"/>
+          <w:sz w:val="22"/>
+          <w:szCs w:val="22"/>
+          <w:lang w:val="es-ES"/>
+        </w:rPr>
+        <w:t>typecase</w:t>
+      </w:r>
+      <w:r>
+        <w:rPr>
+          <w:rFonts w:ascii="Arial" w:hAnsi="Arial" w:eastAsia="Arial" w:cs="Arial"/>
+          <w:noProof w:val="0"/>
+          <w:sz w:val="22"/>
+          <w:szCs w:val="22"/>
+          <w:lang w:val="es-ES"/>
+        </w:rPr>
+        <w:t>. De esta manera, el cálculo de la posición dentro del ciclo del semáforo solo se ejecuta cuando el valor recibido es numérico. En caso contrario, la función devuelve un mensaje informando que el dato ingresado no es válido.</w:t>
+      </w:r>
+    </w:p>
+    <w:p>
+      <w:pPr/>
+      <w:r>
+        <w:rPr>
+          <w:rFonts w:ascii="Arial" w:hAnsi="Arial" w:eastAsia="Arial" w:cs="Arial"/>
+          <w:noProof w:val="0"/>
+          <w:sz w:val="22"/>
+          <w:szCs w:val="22"/>
+          <w:lang w:val="es-ES"/>
+        </w:rPr>
+        <w:t>Esta modificación permite mantener la validación de tipos requerida, mejorar la legibilidad del código y adecuar la implementación a los criterios de diseño establecidos por la cátedra.</w:t>
+      </w:r>
+    </w:p>
+    <w:p>
+      <w:pPr>
+        <w:rPr>
+          <w:rFonts w:ascii="Arial" w:hAnsi="Arial" w:eastAsia="Arial" w:cs="Arial"/>
+          <w:noProof w:val="0"/>
+          <w:sz w:val="22"/>
+          <w:szCs w:val="22"/>
+          <w:lang w:val="es-ES"/>
+        </w:rPr>
+      </w:pPr>
+    </w:p>
+    <w:p>
+      <w:pPr>
+        <w:pStyle w:val="Normal"/>
+      </w:pPr>
+      <w:r>
+        <w:drawing>
+          <wp:inline wp14:editId="4E51634F" wp14:anchorId="50C122CD">
+            <wp:extent cx="4473328" cy="3026963"/>
+            <wp:effectExtent l="0" t="0" r="0" b="0"/>
+            <wp:docPr id="450043167" name="drawing"/>
+            <wp:cNvGraphicFramePr>
+              <a:graphicFrameLocks noChangeAspect="1"/>
+            </wp:cNvGraphicFramePr>
+            <a:graphic>
+              <a:graphicData xmlns:a="http://schemas.openxmlformats.org/drawingml/2006/main" uri="http://schemas.openxmlformats.org/drawingml/2006/picture">
+                <pic:pic xmlns:pic="http://schemas.openxmlformats.org/drawingml/2006/picture">
+                  <pic:nvPicPr>
+                    <pic:cNvPr id="450043167" name="Picture 450043167"/>
+                    <pic:cNvPicPr/>
+                  </pic:nvPicPr>
+                  <pic:blipFill>
+                    <a:blip xmlns:r="http://schemas.openxmlformats.org/officeDocument/2006/relationships" r:embed="rId872394957">
+                      <a:extLst>
+                        <a:ext uri="{28A0092B-C50C-407E-A947-70E740481C1C}">
+                          <a14:useLocalDpi xmlns:a14="http://schemas.microsoft.com/office/drawing/2010/main"/>
+                        </a:ext>
+                      </a:extLst>
+                    </a:blip>
+                    <a:stretch>
+                      <a:fillRect/>
+                    </a:stretch>
+                  </pic:blipFill>
+                  <pic:spPr>
+                    <a:xfrm rot="0">
+                      <a:off x="0" y="0"/>
+                      <a:ext cx="4473328" cy="3026963"/>
+                    </a:xfrm>
+                    <a:prstGeom prst="rect">
+                      <a:avLst/>
+                    </a:prstGeom>
+                  </pic:spPr>
+                </pic:pic>
+              </a:graphicData>
+            </a:graphic>
+          </wp:inline>
+        </w:drawing>
+      </w:r>
+    </w:p>
+    <w:p>
+      <w:pPr>
+        <w:pStyle w:val="Normal"/>
+      </w:pPr>
+      <w:r>
+        <w:rPr/>
+        <w:t>Funcion</w:t>
+      </w:r>
+      <w:r>
+        <w:rPr/>
+        <w:t xml:space="preserve"> llamada con validacion.</w:t>
+      </w:r>
+    </w:p>
+    <w:p>
+      <w:r>
+        <w:rPr>
+          <w:rFonts w:ascii="Aptos" w:hAnsi="Aptos" w:eastAsia="Aptos" w:cs="Aptos"/>
+          <w:b w:val="1"/>
+          <w:bCs w:val="1"/>
+          <w:noProof w:val="0"/>
+          <w:sz w:val="24"/>
+          <w:szCs w:val="24"/>
+          <w:lang w:val="es-ES"/>
+        </w:rPr>
+        <w:t>Fase 3: Diferencias entre funciones de Lisp y Clojure</w:t>
+      </w:r>
+    </w:p>
+    <w:p>
+      <w:r>
+        <w:rPr>
+          <w:rFonts w:ascii="Aptos" w:hAnsi="Aptos" w:eastAsia="Aptos" w:cs="Aptos"/>
+          <w:noProof w:val="0"/>
+          <w:sz w:val="24"/>
+          <w:szCs w:val="24"/>
+          <w:lang w:val="es-ES"/>
+        </w:rPr>
+        <w:t xml:space="preserve">Luego de corregir el error identificado en la fase anterior, se procedió a migrar la función </w:t>
+      </w:r>
+      <w:r>
+        <w:rPr>
+          <w:rFonts w:ascii="Consolas" w:hAnsi="Consolas" w:eastAsia="Consolas" w:cs="Consolas"/>
+          <w:noProof w:val="0"/>
+          <w:sz w:val="24"/>
+          <w:szCs w:val="24"/>
+          <w:lang w:val="es-ES"/>
+        </w:rPr>
+        <w:t>timer</w:t>
+      </w:r>
+      <w:r>
+        <w:rPr>
+          <w:rFonts w:ascii="Aptos" w:hAnsi="Aptos" w:eastAsia="Aptos" w:cs="Aptos"/>
+          <w:noProof w:val="0"/>
+          <w:sz w:val="24"/>
+          <w:szCs w:val="24"/>
+          <w:lang w:val="es-ES"/>
+        </w:rPr>
+        <w:t xml:space="preserve"> a Clojure para completar el requerimiento correspondiente a la Fase 3.</w:t>
+      </w:r>
+    </w:p>
+    <w:p>
+      <w:r>
+        <w:rPr>
+          <w:rFonts w:ascii="Aptos" w:hAnsi="Aptos" w:eastAsia="Aptos" w:cs="Aptos"/>
+          <w:noProof w:val="0"/>
+          <w:sz w:val="24"/>
+          <w:szCs w:val="24"/>
+          <w:lang w:val="es-ES"/>
+        </w:rPr>
+        <w:t xml:space="preserve">Durante este proceso se observó que Clojure no dispone de una estructura equivalente a </w:t>
+      </w:r>
+      <w:r>
+        <w:rPr>
+          <w:rFonts w:ascii="Consolas" w:hAnsi="Consolas" w:eastAsia="Consolas" w:cs="Consolas"/>
+          <w:noProof w:val="0"/>
+          <w:sz w:val="24"/>
+          <w:szCs w:val="24"/>
+          <w:lang w:val="es-ES"/>
+        </w:rPr>
+        <w:t>typecase</w:t>
+      </w:r>
+      <w:r>
+        <w:rPr>
+          <w:rFonts w:ascii="Aptos" w:hAnsi="Aptos" w:eastAsia="Aptos" w:cs="Aptos"/>
+          <w:noProof w:val="0"/>
+          <w:sz w:val="24"/>
+          <w:szCs w:val="24"/>
+          <w:lang w:val="es-ES"/>
+        </w:rPr>
+        <w:t>, utilizada en la implementación original en Lisp para validar el tipo de dato recibido. Debido a esta diferencia entre ambos lenguajes, fue necesario realizar un rediseño de la solución para obtener una traducción adecuada de la función.</w:t>
+      </w:r>
+    </w:p>
+    <w:p>
+      <w:r>
+        <w:rPr>
+          <w:rFonts w:ascii="Aptos" w:hAnsi="Aptos" w:eastAsia="Aptos" w:cs="Aptos"/>
+          <w:noProof w:val="0"/>
+          <w:sz w:val="24"/>
+          <w:szCs w:val="24"/>
+          <w:lang w:val="es-ES"/>
+        </w:rPr>
+        <w:t>Para resolver este inconveniente, se decidió separar la lógica de validación de tipos de la lógica encargada de calcular la posición dentro del ciclo del semáforo. Con este objetivo, se implementó una función auxiliar responsable del cálculo de la posición, la cual es invocada únicamente después de verificar que el valor recibido sea de tipo numérico.</w:t>
+      </w:r>
+    </w:p>
+    <w:p>
+      <w:r>
+        <w:rPr>
+          <w:rFonts w:ascii="Aptos" w:hAnsi="Aptos" w:eastAsia="Aptos" w:cs="Aptos"/>
+          <w:noProof w:val="0"/>
+          <w:sz w:val="24"/>
+          <w:szCs w:val="24"/>
+          <w:lang w:val="es-ES"/>
+        </w:rPr>
+        <w:t>Esta modificación permitió conservar el comportamiento original de la función, garantizar su correcto funcionamiento en Clojure y mejorar la organización del código mediante una separación más clara de responsabilidades.</w:t>
+      </w:r>
+    </w:p>
+    <w:p>
+      <w:pPr>
+        <w:pStyle w:val="Normal"/>
+      </w:pPr>
+      <w:r>
+        <w:rPr>
+          <w:rFonts w:ascii="Aptos" w:hAnsi="Aptos" w:eastAsia="Aptos" w:cs="Aptos"/>
+          <w:noProof w:val="0"/>
+          <w:sz w:val="24"/>
+          <w:szCs w:val="24"/>
+          <w:lang w:val="es-ES"/>
+        </w:rPr>
+        <w:t xml:space="preserve">Fuentes utilizadas: </w:t>
+      </w:r>
+    </w:p>
+    <w:p>
+      <w:pPr>
+        <w:pStyle w:val="Normal"/>
+      </w:pPr>
+      <w:r>
+        <w:rPr>
+          <w:noProof w:val="0"/>
+          <w:lang w:val="es-ES"/>
+        </w:rPr>
+        <w:t xml:space="preserve"> </w:t>
+      </w:r>
+      <w:hyperlink r:id="R6d98a5846f9d4a6f">
+        <w:r>
+          <w:rPr>
+            <w:rStyle w:val="Hyperlink"/>
+            <w:noProof w:val="0"/>
+            <w:lang w:val="es-ES"/>
+          </w:rPr>
+          <w:t>Clojurie Cheatsheet</w:t>
+        </w:r>
+      </w:hyperlink>
+    </w:p>
+    <w:p>
+      <w:pPr>
+        <w:pStyle w:val="Normal"/>
+      </w:pPr>
+      <w:hyperlink r:id="R3493d885a90344d5">
+        <w:r>
+          <w:rPr>
+            <w:rStyle w:val="Hyperlink"/>
+            <w:noProof w:val="0"/>
+            <w:lang w:val="es-ES"/>
+          </w:rPr>
+          <w:t>Clojure online compiler</w:t>
+        </w:r>
+      </w:hyperlink>
+    </w:p>
+    <w:p>
+      <w:pPr>
+        <w:pStyle w:val="Normal"/>
+      </w:pPr>
+    </w:p>
+    <w:p>
+      <w:pPr>
+        <w:pStyle w:val="Normal"/>
+      </w:pPr>
+      <w:r>
+        <w:drawing>
+          <wp:inline wp14:editId="3FAC42B5" wp14:anchorId="1A243239">
+            <wp:extent cx="5342083" cy="3398815"/>
+            <wp:effectExtent l="0" t="0" r="0" b="0"/>
+            <wp:docPr id="1858421985" name="drawing"/>
+            <wp:cNvGraphicFramePr>
+              <a:graphicFrameLocks noChangeAspect="1"/>
+            </wp:cNvGraphicFramePr>
+            <a:graphic>
+              <a:graphicData xmlns:a="http://schemas.openxmlformats.org/drawingml/2006/main" uri="http://schemas.openxmlformats.org/drawingml/2006/picture">
+                <pic:pic xmlns:pic="http://schemas.openxmlformats.org/drawingml/2006/picture">
+                  <pic:nvPicPr>
+                    <pic:cNvPr id="1858421985" name="Picture 1858421985"/>
+                    <pic:cNvPicPr/>
+                  </pic:nvPicPr>
+                  <pic:blipFill>
+                    <a:blip xmlns:r="http://schemas.openxmlformats.org/officeDocument/2006/relationships" r:embed="rId686731755">
+                      <a:extLst>
+                        <a:ext uri="{28A0092B-C50C-407E-A947-70E740481C1C}">
+                          <a14:useLocalDpi xmlns:a14="http://schemas.microsoft.com/office/drawing/2010/main"/>
+                        </a:ext>
+                      </a:extLst>
+                    </a:blip>
+                    <a:stretch>
+                      <a:fillRect/>
+                    </a:stretch>
+                  </pic:blipFill>
+                  <pic:spPr>
+                    <a:xfrm>
+                      <a:off x="0" y="0"/>
+                      <a:ext cx="5342083" cy="3398815"/>
+                    </a:xfrm>
+                    <a:prstGeom prst="rect">
+                      <a:avLst/>
+                    </a:prstGeom>
+                  </pic:spPr>
+                </pic:pic>
+              </a:graphicData>
+            </a:graphic>
+          </wp:inline>
+        </w:drawing>
+      </w:r>
+    </w:p>
+    <w:p>
+      <w:pPr>
+        <w:pStyle w:val="Normal"/>
+      </w:pPr>
+      <w:r>
+        <w:rPr/>
+        <w:t>Funcion</w:t>
+      </w:r>
+      <w:r>
+        <w:rPr/>
+        <w:t xml:space="preserve"> auxiliar implementada en </w:t>
+      </w:r>
+      <w:r>
+        <w:rPr/>
+        <w:t>clojure</w:t>
+      </w:r>
+      <w:r>
+        <w:rPr/>
+        <w:t>.</w:t>
+      </w:r>
+    </w:p>
+    <w:p>
+      <w:r>
+        <w:rPr>
+          <w:rFonts w:ascii="Aptos" w:hAnsi="Aptos" w:eastAsia="Aptos" w:cs="Aptos"/>
+          <w:b w:val="1"/>
+          <w:bCs w:val="1"/>
+          <w:noProof w:val="0"/>
+          <w:sz w:val="24"/>
+          <w:szCs w:val="24"/>
+          <w:lang w:val="es-ES"/>
+        </w:rPr>
+        <w:t xml:space="preserve">Sobre </w:t>
+      </w:r>
+      <w:r>
+        <w:rPr>
+          <w:rFonts w:ascii="Aptos" w:hAnsi="Aptos" w:eastAsia="Aptos" w:cs="Aptos"/>
+          <w:b w:val="1"/>
+          <w:bCs w:val="1"/>
+          <w:noProof w:val="0"/>
+          <w:sz w:val="24"/>
+          <w:szCs w:val="24"/>
+          <w:lang w:val="es-ES"/>
+        </w:rPr>
+        <w:t>Clojure:</w:t>
+      </w:r>
+    </w:p>
+    <w:p>
+      <w:pPr>
+        <w:pStyle w:val="ListParagraph"/>
+        <w:numPr>
+          <w:ilvl w:val="0"/>
+          <w:numId w:val="1"/>
+        </w:numPr>
+        <w:spacing w:before="0" w:beforeAutospacing="off" w:after="0" w:afterAutospacing="off"/>
+        <w:rPr>
+          <w:rFonts w:ascii="Arial" w:hAnsi="Arial" w:eastAsia="Arial" w:cs="Arial"/>
+          <w:b w:val="0"/>
+          <w:bCs w:val="0"/>
+          <w:i w:val="0"/>
+          <w:iCs w:val="0"/>
+          <w:strike w:val="0"/>
+          <w:dstrike w:val="0"/>
+          <w:noProof w:val="0"/>
+          <w:color w:val="000000" w:themeColor="text1" w:themeTint="FF" w:themeShade="FF"/>
+          <w:sz w:val="22"/>
+          <w:szCs w:val="22"/>
+          <w:u w:val="none"/>
+          <w:lang w:val="es-ES"/>
+        </w:rPr>
+      </w:pPr>
+      <w:r>
+        <w:rPr>
+          <w:rFonts w:ascii="Arial" w:hAnsi="Arial" w:eastAsia="Arial" w:cs="Arial"/>
+          <w:b w:val="0"/>
+          <w:bCs w:val="0"/>
+          <w:i w:val="0"/>
+          <w:iCs w:val="0"/>
+          <w:strike w:val="0"/>
+          <w:dstrike w:val="0"/>
+          <w:noProof w:val="0"/>
+          <w:color w:val="000000" w:themeColor="text1" w:themeTint="FF" w:themeShade="FF"/>
+          <w:sz w:val="22"/>
+          <w:szCs w:val="22"/>
+          <w:u w:val="none"/>
+          <w:lang w:val="es-ES"/>
+        </w:rPr>
+        <w:t>1. Ambos lenguajes son Lisps, pero Clojure elimina los símbolos cotizados (</w:t>
+      </w:r>
+      <w:r>
+        <w:rPr>
+          <w:rFonts w:ascii="Roboto Mono" w:hAnsi="Roboto Mono" w:eastAsia="Roboto Mono" w:cs="Roboto Mono"/>
+          <w:b w:val="0"/>
+          <w:bCs w:val="0"/>
+          <w:i w:val="0"/>
+          <w:iCs w:val="0"/>
+          <w:strike w:val="0"/>
+          <w:dstrike w:val="0"/>
+          <w:noProof w:val="0"/>
+          <w:color w:val="188038"/>
+          <w:sz w:val="22"/>
+          <w:szCs w:val="22"/>
+          <w:u w:val="none"/>
+          <w:lang w:val="es-ES"/>
+        </w:rPr>
+        <w:t>'rojo</w:t>
+      </w:r>
+      <w:r>
+        <w:rPr>
+          <w:rFonts w:ascii="Arial" w:hAnsi="Arial" w:eastAsia="Arial" w:cs="Arial"/>
+          <w:b w:val="0"/>
+          <w:bCs w:val="0"/>
+          <w:i w:val="0"/>
+          <w:iCs w:val="0"/>
+          <w:strike w:val="0"/>
+          <w:dstrike w:val="0"/>
+          <w:noProof w:val="0"/>
+          <w:color w:val="000000" w:themeColor="text1" w:themeTint="FF" w:themeShade="FF"/>
+          <w:sz w:val="22"/>
+          <w:szCs w:val="22"/>
+          <w:u w:val="none"/>
+          <w:lang w:val="es-ES"/>
+        </w:rPr>
+        <w:t xml:space="preserve">) en favor de los </w:t>
+      </w:r>
+      <w:r>
+        <w:rPr>
+          <w:rFonts w:ascii="Arial" w:hAnsi="Arial" w:eastAsia="Arial" w:cs="Arial"/>
+          <w:b w:val="0"/>
+          <w:bCs w:val="0"/>
+          <w:i w:val="1"/>
+          <w:iCs w:val="1"/>
+          <w:strike w:val="0"/>
+          <w:dstrike w:val="0"/>
+          <w:noProof w:val="0"/>
+          <w:color w:val="000000" w:themeColor="text1" w:themeTint="FF" w:themeShade="FF"/>
+          <w:sz w:val="22"/>
+          <w:szCs w:val="22"/>
+          <w:u w:val="none"/>
+          <w:lang w:val="es-ES"/>
+        </w:rPr>
+        <w:t>Keywords</w:t>
+      </w:r>
+      <w:r>
+        <w:rPr>
+          <w:rFonts w:ascii="Arial" w:hAnsi="Arial" w:eastAsia="Arial" w:cs="Arial"/>
+          <w:b w:val="0"/>
+          <w:bCs w:val="0"/>
+          <w:i w:val="0"/>
+          <w:iCs w:val="0"/>
+          <w:strike w:val="0"/>
+          <w:dstrike w:val="0"/>
+          <w:noProof w:val="0"/>
+          <w:color w:val="000000" w:themeColor="text1" w:themeTint="FF" w:themeShade="FF"/>
+          <w:sz w:val="22"/>
+          <w:szCs w:val="22"/>
+          <w:u w:val="none"/>
+          <w:lang w:val="es-ES"/>
+        </w:rPr>
+        <w:t xml:space="preserve"> (</w:t>
+      </w:r>
+      <w:r>
+        <w:rPr>
+          <w:rFonts w:ascii="Roboto Mono" w:hAnsi="Roboto Mono" w:eastAsia="Roboto Mono" w:cs="Roboto Mono"/>
+          <w:b w:val="0"/>
+          <w:bCs w:val="0"/>
+          <w:i w:val="0"/>
+          <w:iCs w:val="0"/>
+          <w:strike w:val="0"/>
+          <w:dstrike w:val="0"/>
+          <w:noProof w:val="0"/>
+          <w:color w:val="188038"/>
+          <w:sz w:val="22"/>
+          <w:szCs w:val="22"/>
+          <w:u w:val="none"/>
+          <w:lang w:val="es-ES"/>
+        </w:rPr>
+        <w:t>:rojo</w:t>
+      </w:r>
+      <w:r>
+        <w:rPr>
+          <w:rFonts w:ascii="Arial" w:hAnsi="Arial" w:eastAsia="Arial" w:cs="Arial"/>
+          <w:b w:val="0"/>
+          <w:bCs w:val="0"/>
+          <w:i w:val="0"/>
+          <w:iCs w:val="0"/>
+          <w:strike w:val="0"/>
+          <w:dstrike w:val="0"/>
+          <w:noProof w:val="0"/>
+          <w:color w:val="000000" w:themeColor="text1" w:themeTint="FF" w:themeShade="FF"/>
+          <w:sz w:val="22"/>
+          <w:szCs w:val="22"/>
+          <w:u w:val="none"/>
+          <w:lang w:val="es-ES"/>
+        </w:rPr>
+        <w:t xml:space="preserve">). ¿Cuál es la ventaja técnica y de rendimiento de un Keyword en Clojure para mapear estados? </w:t>
+      </w:r>
+    </w:p>
+    <w:p>
+      <w:pPr>
+        <w:pStyle w:val="ListParagraph"/>
+        <w:spacing w:before="0" w:beforeAutospacing="off" w:after="0" w:afterAutospacing="off"/>
+        <w:ind w:left="720"/>
+        <w:rPr>
+          <w:rFonts w:ascii="Arial" w:hAnsi="Arial" w:eastAsia="Arial" w:cs="Arial"/>
+          <w:b w:val="0"/>
+          <w:bCs w:val="0"/>
+          <w:i w:val="0"/>
+          <w:iCs w:val="0"/>
+          <w:strike w:val="0"/>
+          <w:dstrike w:val="0"/>
+          <w:noProof w:val="0"/>
+          <w:color w:val="000000" w:themeColor="text1" w:themeTint="FF" w:themeShade="FF"/>
+          <w:sz w:val="22"/>
+          <w:szCs w:val="22"/>
+          <w:u w:val="none"/>
+          <w:lang w:val="es-ES"/>
+        </w:rPr>
+      </w:pPr>
+    </w:p>
+    <w:p>
+      <w:pPr>
+        <w:pStyle w:val="ListParagraph"/>
+        <w:spacing w:before="0" w:beforeAutospacing="off" w:after="0" w:afterAutospacing="off"/>
+        <w:ind w:left="720"/>
+      </w:pPr>
+      <w:r>
+        <w:rPr>
+          <w:rFonts w:ascii="Arial" w:hAnsi="Arial" w:eastAsia="Arial" w:cs="Arial"/>
+          <w:noProof w:val="0"/>
+          <w:sz w:val="22"/>
+          <w:szCs w:val="22"/>
+          <w:u w:val="none"/>
+          <w:lang w:val="es-ES"/>
+        </w:rPr>
+        <w:t xml:space="preserve">En Common Lisp los estados del semáforo pueden representarse mediante símbolos como </w:t>
+      </w:r>
+      <w:r>
+        <w:rPr>
+          <w:rFonts w:ascii="Arial" w:hAnsi="Arial" w:eastAsia="Arial" w:cs="Arial"/>
+          <w:noProof w:val="0"/>
+          <w:sz w:val="22"/>
+          <w:szCs w:val="22"/>
+          <w:u w:val="none"/>
+          <w:lang w:val="es-ES"/>
+        </w:rPr>
+        <w:t>'rojo</w:t>
+      </w:r>
+      <w:r>
+        <w:rPr>
+          <w:rFonts w:ascii="Arial" w:hAnsi="Arial" w:eastAsia="Arial" w:cs="Arial"/>
+          <w:noProof w:val="0"/>
+          <w:sz w:val="22"/>
+          <w:szCs w:val="22"/>
+          <w:u w:val="none"/>
+          <w:lang w:val="es-ES"/>
+        </w:rPr>
+        <w:t xml:space="preserve">, </w:t>
+      </w:r>
+      <w:r>
+        <w:rPr>
+          <w:rFonts w:ascii="Arial" w:hAnsi="Arial" w:eastAsia="Arial" w:cs="Arial"/>
+          <w:noProof w:val="0"/>
+          <w:sz w:val="22"/>
+          <w:szCs w:val="22"/>
+          <w:u w:val="none"/>
+          <w:lang w:val="es-ES"/>
+        </w:rPr>
+        <w:t>'verde</w:t>
+      </w:r>
+      <w:r>
+        <w:rPr>
+          <w:rFonts w:ascii="Arial" w:hAnsi="Arial" w:eastAsia="Arial" w:cs="Arial"/>
+          <w:noProof w:val="0"/>
+          <w:sz w:val="22"/>
+          <w:szCs w:val="22"/>
+          <w:u w:val="none"/>
+          <w:lang w:val="es-ES"/>
+        </w:rPr>
+        <w:t xml:space="preserve"> o </w:t>
+      </w:r>
+      <w:r>
+        <w:rPr>
+          <w:rFonts w:ascii="Arial" w:hAnsi="Arial" w:eastAsia="Arial" w:cs="Arial"/>
+          <w:noProof w:val="0"/>
+          <w:sz w:val="22"/>
+          <w:szCs w:val="22"/>
+          <w:u w:val="none"/>
+          <w:lang w:val="es-ES"/>
+        </w:rPr>
+        <w:t>'amarillo</w:t>
+      </w:r>
+      <w:r>
+        <w:rPr>
+          <w:rFonts w:ascii="Arial" w:hAnsi="Arial" w:eastAsia="Arial" w:cs="Arial"/>
+          <w:noProof w:val="0"/>
+          <w:sz w:val="22"/>
+          <w:szCs w:val="22"/>
+          <w:u w:val="none"/>
+          <w:lang w:val="es-ES"/>
+        </w:rPr>
+        <w:t xml:space="preserve">. </w:t>
+      </w:r>
+      <w:r>
+        <w:rPr>
+          <w:rFonts w:ascii="Arial" w:hAnsi="Arial" w:eastAsia="Arial" w:cs="Arial"/>
+          <w:noProof w:val="0"/>
+          <w:sz w:val="22"/>
+          <w:szCs w:val="22"/>
+          <w:u w:val="none"/>
+          <w:lang w:val="es-ES"/>
+        </w:rPr>
+        <w:t>Clojure</w:t>
+      </w:r>
+      <w:r>
+        <w:rPr>
+          <w:rFonts w:ascii="Arial" w:hAnsi="Arial" w:eastAsia="Arial" w:cs="Arial"/>
+          <w:noProof w:val="0"/>
+          <w:sz w:val="22"/>
+          <w:szCs w:val="22"/>
+          <w:u w:val="none"/>
+          <w:lang w:val="es-ES"/>
+        </w:rPr>
+        <w:t xml:space="preserve"> utiliza </w:t>
+      </w:r>
+      <w:r>
+        <w:rPr>
+          <w:rFonts w:ascii="Arial" w:hAnsi="Arial" w:eastAsia="Arial" w:cs="Arial"/>
+          <w:noProof w:val="0"/>
+          <w:sz w:val="22"/>
+          <w:szCs w:val="22"/>
+          <w:u w:val="none"/>
+          <w:lang w:val="es-ES"/>
+        </w:rPr>
+        <w:t>keywords</w:t>
+      </w:r>
+      <w:r>
+        <w:rPr>
+          <w:rFonts w:ascii="Arial" w:hAnsi="Arial" w:eastAsia="Arial" w:cs="Arial"/>
+          <w:noProof w:val="0"/>
+          <w:sz w:val="22"/>
+          <w:szCs w:val="22"/>
+          <w:u w:val="none"/>
+          <w:lang w:val="es-ES"/>
+        </w:rPr>
+        <w:t xml:space="preserve"> </w:t>
+      </w:r>
+      <w:r>
+        <w:rPr>
+          <w:rFonts w:ascii="Arial" w:hAnsi="Arial" w:eastAsia="Arial" w:cs="Arial"/>
+          <w:noProof w:val="0"/>
+          <w:sz w:val="22"/>
+          <w:szCs w:val="22"/>
+          <w:u w:val="none"/>
+          <w:lang w:val="es-ES"/>
+        </w:rPr>
+        <w:t>(</w:t>
+      </w:r>
+      <w:r>
+        <w:rPr>
+          <w:rFonts w:ascii="Arial" w:hAnsi="Arial" w:eastAsia="Arial" w:cs="Arial"/>
+          <w:noProof w:val="0"/>
+          <w:sz w:val="22"/>
+          <w:szCs w:val="22"/>
+          <w:u w:val="none"/>
+          <w:lang w:val="es-ES"/>
+        </w:rPr>
+        <w:t>:rojo</w:t>
+      </w:r>
+      <w:r>
+        <w:rPr>
+          <w:rFonts w:ascii="Arial" w:hAnsi="Arial" w:eastAsia="Arial" w:cs="Arial"/>
+          <w:noProof w:val="0"/>
+          <w:sz w:val="22"/>
+          <w:szCs w:val="22"/>
+          <w:u w:val="none"/>
+          <w:lang w:val="es-ES"/>
+        </w:rPr>
+        <w:t xml:space="preserve">, </w:t>
+      </w:r>
+      <w:r>
+        <w:rPr>
+          <w:rFonts w:ascii="Arial" w:hAnsi="Arial" w:eastAsia="Arial" w:cs="Arial"/>
+          <w:noProof w:val="0"/>
+          <w:sz w:val="22"/>
+          <w:szCs w:val="22"/>
+          <w:u w:val="none"/>
+          <w:lang w:val="es-ES"/>
+        </w:rPr>
+        <w:t>:verde</w:t>
+      </w:r>
+      <w:r>
+        <w:rPr>
+          <w:rFonts w:ascii="Arial" w:hAnsi="Arial" w:eastAsia="Arial" w:cs="Arial"/>
+          <w:noProof w:val="0"/>
+          <w:sz w:val="22"/>
+          <w:szCs w:val="22"/>
+          <w:u w:val="none"/>
+          <w:lang w:val="es-ES"/>
+        </w:rPr>
+        <w:t xml:space="preserve">, </w:t>
+      </w:r>
+      <w:r>
+        <w:rPr>
+          <w:rFonts w:ascii="Arial" w:hAnsi="Arial" w:eastAsia="Arial" w:cs="Arial"/>
+          <w:noProof w:val="0"/>
+          <w:sz w:val="22"/>
+          <w:szCs w:val="22"/>
+          <w:u w:val="none"/>
+          <w:lang w:val="es-ES"/>
+        </w:rPr>
+        <w:t>:amarillo</w:t>
+      </w:r>
+      <w:r>
+        <w:rPr>
+          <w:rFonts w:ascii="Arial" w:hAnsi="Arial" w:eastAsia="Arial" w:cs="Arial"/>
+          <w:noProof w:val="0"/>
+          <w:sz w:val="22"/>
+          <w:szCs w:val="22"/>
+          <w:u w:val="none"/>
+          <w:lang w:val="es-ES"/>
+        </w:rPr>
+        <w:t xml:space="preserve">), que son identificadores inmutables y </w:t>
+      </w:r>
+      <w:r>
+        <w:rPr>
+          <w:rFonts w:ascii="Arial" w:hAnsi="Arial" w:eastAsia="Arial" w:cs="Arial"/>
+          <w:noProof w:val="0"/>
+          <w:sz w:val="22"/>
+          <w:szCs w:val="22"/>
+          <w:u w:val="none"/>
+          <w:lang w:val="es-ES"/>
+        </w:rPr>
+        <w:t>autoevaluables</w:t>
+      </w:r>
+      <w:r>
+        <w:rPr>
+          <w:rFonts w:ascii="Arial" w:hAnsi="Arial" w:eastAsia="Arial" w:cs="Arial"/>
+          <w:noProof w:val="0"/>
+          <w:sz w:val="22"/>
+          <w:szCs w:val="22"/>
+          <w:u w:val="none"/>
+          <w:lang w:val="es-ES"/>
+        </w:rPr>
+        <w:t xml:space="preserve"> diseñados especialmente para representar atributos, estados y claves de mapas. A diferencia de los símbolos, los </w:t>
+      </w:r>
+      <w:r>
+        <w:rPr>
+          <w:rFonts w:ascii="Arial" w:hAnsi="Arial" w:eastAsia="Arial" w:cs="Arial"/>
+          <w:noProof w:val="0"/>
+          <w:sz w:val="22"/>
+          <w:szCs w:val="22"/>
+          <w:u w:val="none"/>
+          <w:lang w:val="es-ES"/>
+        </w:rPr>
+        <w:t>keywords</w:t>
+      </w:r>
+      <w:r>
+        <w:rPr>
+          <w:rFonts w:ascii="Arial" w:hAnsi="Arial" w:eastAsia="Arial" w:cs="Arial"/>
+          <w:noProof w:val="0"/>
+          <w:sz w:val="22"/>
+          <w:szCs w:val="22"/>
+          <w:u w:val="none"/>
+          <w:lang w:val="es-ES"/>
+        </w:rPr>
+        <w:t xml:space="preserve"> están </w:t>
+      </w:r>
+      <w:r>
+        <w:rPr>
+          <w:rFonts w:ascii="Arial" w:hAnsi="Arial" w:eastAsia="Arial" w:cs="Arial"/>
+          <w:noProof w:val="0"/>
+          <w:sz w:val="22"/>
+          <w:szCs w:val="22"/>
+          <w:u w:val="none"/>
+          <w:lang w:val="es-ES"/>
+        </w:rPr>
+        <w:t>"</w:t>
+      </w:r>
+      <w:r>
+        <w:rPr>
+          <w:rFonts w:ascii="Arial" w:hAnsi="Arial" w:eastAsia="Arial" w:cs="Arial"/>
+          <w:b w:val="0"/>
+          <w:bCs w:val="0"/>
+          <w:i w:val="0"/>
+          <w:iCs w:val="0"/>
+          <w:caps w:val="0"/>
+          <w:smallCaps w:val="0"/>
+          <w:noProof w:val="0"/>
+          <w:color w:val="auto"/>
+          <w:sz w:val="22"/>
+          <w:szCs w:val="22"/>
+          <w:lang w:val="es-ES"/>
+        </w:rPr>
+        <w:t xml:space="preserve">cached and </w:t>
+      </w:r>
+      <w:r>
+        <w:rPr>
+          <w:rFonts w:ascii="Arial" w:hAnsi="Arial" w:eastAsia="Arial" w:cs="Arial"/>
+          <w:b w:val="0"/>
+          <w:bCs w:val="0"/>
+          <w:i w:val="0"/>
+          <w:iCs w:val="0"/>
+          <w:caps w:val="0"/>
+          <w:smallCaps w:val="0"/>
+          <w:noProof w:val="0"/>
+          <w:color w:val="auto"/>
+          <w:sz w:val="22"/>
+          <w:szCs w:val="22"/>
+          <w:lang w:val="es-ES"/>
+        </w:rPr>
+        <w:t>interned</w:t>
+      </w:r>
+      <w:r>
+        <w:rPr>
+          <w:rFonts w:ascii="Arial" w:hAnsi="Arial" w:eastAsia="Arial" w:cs="Arial"/>
+          <w:b w:val="0"/>
+          <w:bCs w:val="0"/>
+          <w:i w:val="0"/>
+          <w:iCs w:val="0"/>
+          <w:caps w:val="0"/>
+          <w:smallCaps w:val="0"/>
+          <w:noProof w:val="0"/>
+          <w:color w:val="auto"/>
+          <w:sz w:val="22"/>
+          <w:szCs w:val="22"/>
+          <w:lang w:val="es-ES"/>
+        </w:rPr>
+        <w:t>” globalmente</w:t>
+      </w:r>
+      <w:r>
+        <w:rPr>
+          <w:rFonts w:ascii="Arial" w:hAnsi="Arial" w:eastAsia="Arial" w:cs="Arial"/>
+          <w:noProof w:val="0"/>
+          <w:color w:val="auto"/>
+          <w:sz w:val="22"/>
+          <w:szCs w:val="22"/>
+          <w:u w:val="none"/>
+          <w:lang w:val="es-ES"/>
+        </w:rPr>
+        <w:t>,</w:t>
+      </w:r>
+      <w:r>
+        <w:rPr>
+          <w:rFonts w:ascii="Arial" w:hAnsi="Arial" w:eastAsia="Arial" w:cs="Arial"/>
+          <w:noProof w:val="0"/>
+          <w:sz w:val="22"/>
+          <w:szCs w:val="22"/>
+          <w:u w:val="none"/>
+          <w:lang w:val="es-ES"/>
+        </w:rPr>
+        <w:t xml:space="preserve"> por lo que una misma palabra clave se reutiliza en toda la ejecución del programa. Esto reduce el consumo de memoria y permite realizar comparaciones y búsquedas de manera muy eficiente. Además, los </w:t>
+      </w:r>
+      <w:r>
+        <w:rPr>
+          <w:rFonts w:ascii="Arial" w:hAnsi="Arial" w:eastAsia="Arial" w:cs="Arial"/>
+          <w:noProof w:val="0"/>
+          <w:sz w:val="22"/>
+          <w:szCs w:val="22"/>
+          <w:u w:val="none"/>
+          <w:lang w:val="es-ES"/>
+        </w:rPr>
+        <w:t>keywords</w:t>
+      </w:r>
+      <w:r>
+        <w:rPr>
+          <w:rFonts w:ascii="Arial" w:hAnsi="Arial" w:eastAsia="Arial" w:cs="Arial"/>
+          <w:noProof w:val="0"/>
+          <w:sz w:val="22"/>
+          <w:szCs w:val="22"/>
+          <w:u w:val="none"/>
+          <w:lang w:val="es-ES"/>
+        </w:rPr>
+        <w:t xml:space="preserve"> se integran naturalmente con los mapas de </w:t>
+      </w:r>
+      <w:r>
+        <w:rPr>
+          <w:rFonts w:ascii="Arial" w:hAnsi="Arial" w:eastAsia="Arial" w:cs="Arial"/>
+          <w:noProof w:val="0"/>
+          <w:sz w:val="22"/>
+          <w:szCs w:val="22"/>
+          <w:u w:val="none"/>
+          <w:lang w:val="es-ES"/>
+        </w:rPr>
+        <w:t>Clojure</w:t>
+      </w:r>
+      <w:r>
+        <w:rPr>
+          <w:rFonts w:ascii="Arial" w:hAnsi="Arial" w:eastAsia="Arial" w:cs="Arial"/>
+          <w:noProof w:val="0"/>
+          <w:sz w:val="22"/>
+          <w:szCs w:val="22"/>
+          <w:u w:val="none"/>
+          <w:lang w:val="es-ES"/>
+        </w:rPr>
+        <w:t xml:space="preserve">, que son una de las estructuras de datos más utilizadas del lenguaje. En el simulador semafórico, representar los estados </w:t>
+      </w:r>
+      <w:r>
+        <w:rPr>
+          <w:rFonts w:ascii="Arial" w:hAnsi="Arial" w:eastAsia="Arial" w:cs="Arial"/>
+          <w:noProof w:val="0"/>
+          <w:sz w:val="22"/>
+          <w:szCs w:val="22"/>
+          <w:u w:val="none"/>
+          <w:lang w:val="es-ES"/>
+        </w:rPr>
+        <w:t xml:space="preserve">mediante </w:t>
+      </w:r>
+      <w:r>
+        <w:rPr>
+          <w:rFonts w:ascii="Arial" w:hAnsi="Arial" w:eastAsia="Arial" w:cs="Arial"/>
+          <w:noProof w:val="0"/>
+          <w:sz w:val="22"/>
+          <w:szCs w:val="22"/>
+          <w:u w:val="none"/>
+          <w:lang w:val="es-ES"/>
+        </w:rPr>
+        <w:t>:rojo</w:t>
+      </w:r>
+      <w:r>
+        <w:rPr>
+          <w:rFonts w:ascii="Arial" w:hAnsi="Arial" w:eastAsia="Arial" w:cs="Arial"/>
+          <w:noProof w:val="0"/>
+          <w:sz w:val="22"/>
+          <w:szCs w:val="22"/>
+          <w:u w:val="none"/>
+          <w:lang w:val="es-ES"/>
+        </w:rPr>
+        <w:t xml:space="preserve">, </w:t>
+      </w:r>
+      <w:r>
+        <w:rPr>
+          <w:rFonts w:ascii="Arial" w:hAnsi="Arial" w:eastAsia="Arial" w:cs="Arial"/>
+          <w:noProof w:val="0"/>
+          <w:sz w:val="22"/>
+          <w:szCs w:val="22"/>
+          <w:u w:val="none"/>
+          <w:lang w:val="es-ES"/>
+        </w:rPr>
+        <w:t>:verde</w:t>
+      </w:r>
+      <w:r>
+        <w:rPr>
+          <w:rFonts w:ascii="Arial" w:hAnsi="Arial" w:eastAsia="Arial" w:cs="Arial"/>
+          <w:noProof w:val="0"/>
+          <w:sz w:val="22"/>
+          <w:szCs w:val="22"/>
+          <w:u w:val="none"/>
+          <w:lang w:val="es-ES"/>
+        </w:rPr>
+        <w:t xml:space="preserve"> </w:t>
+      </w:r>
+      <w:r>
+        <w:rPr>
+          <w:rFonts w:ascii="Arial" w:hAnsi="Arial" w:eastAsia="Arial" w:cs="Arial"/>
+          <w:noProof w:val="0"/>
+          <w:sz w:val="22"/>
+          <w:szCs w:val="22"/>
+          <w:u w:val="none"/>
+          <w:lang w:val="es-ES"/>
+        </w:rPr>
+        <w:t xml:space="preserve">y </w:t>
+      </w:r>
+      <w:r>
+        <w:rPr>
+          <w:rFonts w:ascii="Arial" w:hAnsi="Arial" w:eastAsia="Arial" w:cs="Arial"/>
+          <w:noProof w:val="0"/>
+          <w:sz w:val="22"/>
+          <w:szCs w:val="22"/>
+          <w:u w:val="none"/>
+          <w:lang w:val="es-ES"/>
+        </w:rPr>
+        <w:t>:amarillo</w:t>
+      </w:r>
+      <w:r>
+        <w:rPr>
+          <w:rFonts w:ascii="Arial" w:hAnsi="Arial" w:eastAsia="Arial" w:cs="Arial"/>
+          <w:noProof w:val="0"/>
+          <w:sz w:val="22"/>
+          <w:szCs w:val="22"/>
+          <w:u w:val="none"/>
+          <w:lang w:val="es-ES"/>
+        </w:rPr>
+        <w:t xml:space="preserve"> facilita su almacenamiento y consulta en mapas, manteniendo una representación simple, segura y eficiente.</w:t>
+      </w:r>
+    </w:p>
+    <w:p>
+      <w:pPr>
+        <w:pStyle w:val="ListParagraph"/>
+        <w:spacing w:before="0" w:beforeAutospacing="off" w:after="0" w:afterAutospacing="off"/>
+        <w:ind w:left="720"/>
+        <w:rPr>
+          <w:rFonts w:ascii="Arial" w:hAnsi="Arial" w:eastAsia="Arial" w:cs="Arial"/>
+          <w:noProof w:val="0"/>
+          <w:sz w:val="22"/>
+          <w:szCs w:val="22"/>
+          <w:lang w:val="es-ES"/>
+        </w:rPr>
+      </w:pPr>
+      <w:r>
+        <w:rPr>
+          <w:rFonts w:ascii="Arial" w:hAnsi="Arial" w:eastAsia="Arial" w:cs="Arial"/>
+          <w:noProof w:val="0"/>
+          <w:sz w:val="22"/>
+          <w:szCs w:val="22"/>
+          <w:lang w:val="es-ES"/>
+        </w:rPr>
+        <w:t xml:space="preserve">Sin embargo, en este caso la diferencia práctica respecto de Common Lisp no es tan grande, ya que los símbolos </w:t>
+      </w:r>
+      <w:r>
+        <w:rPr>
+          <w:rFonts w:ascii="Arial" w:hAnsi="Arial" w:eastAsia="Arial" w:cs="Arial"/>
+          <w:noProof w:val="0"/>
+          <w:sz w:val="22"/>
+          <w:szCs w:val="22"/>
+          <w:lang w:val="es-ES"/>
+        </w:rPr>
+        <w:t>'rojo</w:t>
+      </w:r>
+      <w:r>
+        <w:rPr>
+          <w:rFonts w:ascii="Arial" w:hAnsi="Arial" w:eastAsia="Arial" w:cs="Arial"/>
+          <w:noProof w:val="0"/>
+          <w:sz w:val="22"/>
+          <w:szCs w:val="22"/>
+          <w:lang w:val="es-ES"/>
+        </w:rPr>
+        <w:t xml:space="preserve">, </w:t>
+      </w:r>
+      <w:r>
+        <w:rPr>
+          <w:rFonts w:ascii="Arial" w:hAnsi="Arial" w:eastAsia="Arial" w:cs="Arial"/>
+          <w:noProof w:val="0"/>
+          <w:sz w:val="22"/>
+          <w:szCs w:val="22"/>
+          <w:lang w:val="es-ES"/>
+        </w:rPr>
+        <w:t>'verde</w:t>
+      </w:r>
+      <w:r>
+        <w:rPr>
+          <w:rFonts w:ascii="Arial" w:hAnsi="Arial" w:eastAsia="Arial" w:cs="Arial"/>
+          <w:noProof w:val="0"/>
+          <w:sz w:val="22"/>
+          <w:szCs w:val="22"/>
+          <w:lang w:val="es-ES"/>
+        </w:rPr>
+        <w:t xml:space="preserve"> y </w:t>
+      </w:r>
+      <w:r>
+        <w:rPr>
+          <w:rFonts w:ascii="Arial" w:hAnsi="Arial" w:eastAsia="Arial" w:cs="Arial"/>
+          <w:noProof w:val="0"/>
+          <w:sz w:val="22"/>
+          <w:szCs w:val="22"/>
+          <w:lang w:val="es-ES"/>
+        </w:rPr>
+        <w:t>'amarillo</w:t>
+      </w:r>
+      <w:r>
+        <w:rPr>
+          <w:rFonts w:ascii="Arial" w:hAnsi="Arial" w:eastAsia="Arial" w:cs="Arial"/>
+          <w:noProof w:val="0"/>
+          <w:sz w:val="22"/>
+          <w:szCs w:val="22"/>
+          <w:lang w:val="es-ES"/>
+        </w:rPr>
+        <w:t xml:space="preserve"> también permiten modelar correctamente los estados del semáforo. La principal ventaja de los keywords aparece cuando los estados se utilizan intensivamente como claves de mapas o estructuras de datos asociativas, que constituyen una parte central del estilo de programación en Clojure.</w:t>
+      </w:r>
+    </w:p>
+    <w:p>
+      <w:pPr>
+        <w:pStyle w:val="Normal"/>
+        <w:spacing w:before="0" w:beforeAutospacing="off" w:after="0" w:afterAutospacing="off"/>
+        <w:rPr>
+          <w:rFonts w:ascii="Arial" w:hAnsi="Arial" w:eastAsia="Arial" w:cs="Arial"/>
+          <w:b w:val="0"/>
+          <w:bCs w:val="0"/>
+          <w:i w:val="0"/>
+          <w:iCs w:val="0"/>
+          <w:strike w:val="0"/>
+          <w:dstrike w:val="0"/>
+          <w:noProof w:val="0"/>
+          <w:color w:val="000000" w:themeColor="text1" w:themeTint="FF" w:themeShade="FF"/>
+          <w:sz w:val="22"/>
+          <w:szCs w:val="22"/>
+          <w:u w:val="none"/>
+          <w:lang w:val="es-ES"/>
+        </w:rPr>
+      </w:pPr>
+    </w:p>
+    <w:p>
+      <w:pPr>
+        <w:pStyle w:val="Normal"/>
+        <w:spacing w:before="0" w:beforeAutospacing="off" w:after="0" w:afterAutospacing="off"/>
+        <w:rPr>
+          <w:rFonts w:ascii="Arial" w:hAnsi="Arial" w:eastAsia="Arial" w:cs="Arial"/>
+          <w:b w:val="0"/>
+          <w:bCs w:val="0"/>
+          <w:i w:val="0"/>
+          <w:iCs w:val="0"/>
+          <w:strike w:val="0"/>
+          <w:dstrike w:val="0"/>
+          <w:noProof w:val="0"/>
+          <w:color w:val="000000" w:themeColor="text1" w:themeTint="FF" w:themeShade="FF"/>
+          <w:sz w:val="22"/>
+          <w:szCs w:val="22"/>
+          <w:u w:val="none"/>
+          <w:lang w:val="es-ES"/>
+        </w:rPr>
+      </w:pPr>
+    </w:p>
+    <w:p>
+      <w:pPr>
+        <w:pStyle w:val="Normal"/>
+        <w:spacing w:before="0" w:beforeAutospacing="off" w:after="0" w:afterAutospacing="off"/>
+        <w:rPr>
+          <w:rFonts w:ascii="Arial" w:hAnsi="Arial" w:eastAsia="Arial" w:cs="Arial"/>
+          <w:b w:val="0"/>
+          <w:bCs w:val="0"/>
+          <w:i w:val="0"/>
+          <w:iCs w:val="0"/>
+          <w:strike w:val="0"/>
+          <w:dstrike w:val="0"/>
+          <w:noProof w:val="0"/>
+          <w:color w:val="000000" w:themeColor="text1" w:themeTint="FF" w:themeShade="FF"/>
+          <w:sz w:val="22"/>
+          <w:szCs w:val="22"/>
+          <w:u w:val="none"/>
+          <w:lang w:val="es-ES"/>
+        </w:rPr>
+      </w:pPr>
+    </w:p>
+    <w:p>
+      <w:pPr>
+        <w:pStyle w:val="ListParagraph"/>
+        <w:numPr>
+          <w:ilvl w:val="0"/>
+          <w:numId w:val="1"/>
+        </w:numPr>
+        <w:spacing w:before="0" w:beforeAutospacing="off" w:after="0" w:afterAutospacing="off"/>
+        <w:rPr>
+          <w:rFonts w:ascii="Arial" w:hAnsi="Arial" w:eastAsia="Arial" w:cs="Arial"/>
+          <w:b w:val="0"/>
+          <w:bCs w:val="0"/>
+          <w:i w:val="0"/>
+          <w:iCs w:val="0"/>
+          <w:strike w:val="0"/>
+          <w:dstrike w:val="0"/>
+          <w:noProof w:val="0"/>
+          <w:color w:val="000000" w:themeColor="text1" w:themeTint="FF" w:themeShade="FF"/>
+          <w:sz w:val="22"/>
+          <w:szCs w:val="22"/>
+          <w:u w:val="none"/>
+          <w:lang w:val="es-ES"/>
+        </w:rPr>
+      </w:pPr>
+      <w:r>
+        <w:rPr>
+          <w:rFonts w:ascii="Arial" w:hAnsi="Arial" w:eastAsia="Arial" w:cs="Arial"/>
+          <w:b w:val="0"/>
+          <w:bCs w:val="0"/>
+          <w:i w:val="0"/>
+          <w:iCs w:val="0"/>
+          <w:strike w:val="0"/>
+          <w:dstrike w:val="0"/>
+          <w:noProof w:val="0"/>
+          <w:color w:val="000000" w:themeColor="text1" w:themeTint="FF" w:themeShade="FF"/>
+          <w:sz w:val="22"/>
+          <w:szCs w:val="22"/>
+          <w:u w:val="none"/>
+          <w:lang w:val="es-ES"/>
+        </w:rPr>
+        <w:t xml:space="preserve">2. </w:t>
+      </w:r>
+      <w:r>
+        <w:rPr>
+          <w:rFonts w:ascii="Arial" w:hAnsi="Arial" w:eastAsia="Arial" w:cs="Arial"/>
+          <w:b w:val="0"/>
+          <w:bCs w:val="0"/>
+          <w:i w:val="0"/>
+          <w:iCs w:val="0"/>
+          <w:strike w:val="0"/>
+          <w:dstrike w:val="0"/>
+          <w:noProof w:val="0"/>
+          <w:color w:val="000000" w:themeColor="text1" w:themeTint="FF" w:themeShade="FF"/>
+          <w:sz w:val="22"/>
+          <w:szCs w:val="22"/>
+          <w:u w:val="none"/>
+          <w:lang w:val="es-ES"/>
+        </w:rPr>
+        <w:t>Clojure</w:t>
+      </w:r>
+      <w:r>
+        <w:rPr>
+          <w:rFonts w:ascii="Arial" w:hAnsi="Arial" w:eastAsia="Arial" w:cs="Arial"/>
+          <w:b w:val="0"/>
+          <w:bCs w:val="0"/>
+          <w:i w:val="0"/>
+          <w:iCs w:val="0"/>
+          <w:strike w:val="0"/>
+          <w:dstrike w:val="0"/>
+          <w:noProof w:val="0"/>
+          <w:color w:val="000000" w:themeColor="text1" w:themeTint="FF" w:themeShade="FF"/>
+          <w:sz w:val="22"/>
+          <w:szCs w:val="22"/>
+          <w:u w:val="none"/>
+          <w:lang w:val="es-ES"/>
+        </w:rPr>
+        <w:t xml:space="preserve"> prohíbe la mutabilidad por defecto usando estructuras de datos persistentes. ¿Cómo maneja </w:t>
+      </w:r>
+      <w:r>
+        <w:rPr>
+          <w:rFonts w:ascii="Arial" w:hAnsi="Arial" w:eastAsia="Arial" w:cs="Arial"/>
+          <w:b w:val="0"/>
+          <w:bCs w:val="0"/>
+          <w:i w:val="0"/>
+          <w:iCs w:val="0"/>
+          <w:strike w:val="0"/>
+          <w:dstrike w:val="0"/>
+          <w:noProof w:val="0"/>
+          <w:color w:val="000000" w:themeColor="text1" w:themeTint="FF" w:themeShade="FF"/>
+          <w:sz w:val="22"/>
+          <w:szCs w:val="22"/>
+          <w:u w:val="none"/>
+          <w:lang w:val="es-ES"/>
+        </w:rPr>
+        <w:t>Clojure</w:t>
+      </w:r>
+      <w:r>
+        <w:rPr>
+          <w:rFonts w:ascii="Arial" w:hAnsi="Arial" w:eastAsia="Arial" w:cs="Arial"/>
+          <w:b w:val="0"/>
+          <w:bCs w:val="0"/>
+          <w:i w:val="0"/>
+          <w:iCs w:val="0"/>
+          <w:strike w:val="0"/>
+          <w:dstrike w:val="0"/>
+          <w:noProof w:val="0"/>
+          <w:color w:val="000000" w:themeColor="text1" w:themeTint="FF" w:themeShade="FF"/>
+          <w:sz w:val="22"/>
+          <w:szCs w:val="22"/>
+          <w:u w:val="none"/>
+          <w:lang w:val="es-ES"/>
+        </w:rPr>
+        <w:t xml:space="preserve"> el paso del tiempo en el simulador semafórico sin modificar variables?</w:t>
+      </w:r>
+    </w:p>
+    <w:p>
+      <w:pPr>
+        <w:pStyle w:val="ListParagraph"/>
+        <w:spacing w:before="0" w:beforeAutospacing="off" w:after="0" w:afterAutospacing="off"/>
+        <w:ind w:left="720"/>
+        <w:rPr>
+          <w:rFonts w:ascii="Arial" w:hAnsi="Arial" w:eastAsia="Arial" w:cs="Arial"/>
+          <w:b w:val="0"/>
+          <w:bCs w:val="0"/>
+          <w:i w:val="0"/>
+          <w:iCs w:val="0"/>
+          <w:strike w:val="0"/>
+          <w:dstrike w:val="0"/>
+          <w:noProof w:val="0"/>
+          <w:color w:val="000000" w:themeColor="text1" w:themeTint="FF" w:themeShade="FF"/>
+          <w:sz w:val="22"/>
+          <w:szCs w:val="22"/>
+          <w:u w:val="none"/>
+          <w:lang w:val="es-ES"/>
+        </w:rPr>
+      </w:pPr>
+    </w:p>
+    <w:p>
+      <w:pPr>
+        <w:rPr>
+          <w:rFonts w:ascii="Arial" w:hAnsi="Arial" w:eastAsia="Arial" w:cs="Arial"/>
+          <w:b w:val="0"/>
+          <w:bCs w:val="0"/>
+          <w:noProof w:val="0"/>
+          <w:sz w:val="22"/>
+          <w:szCs w:val="22"/>
+          <w:lang w:val="es-ES"/>
+        </w:rPr>
+      </w:pPr>
+      <w:r>
+        <w:rPr>
+          <w:rFonts w:ascii="Arial" w:hAnsi="Arial" w:eastAsia="Arial" w:cs="Arial"/>
+          <w:b w:val="0"/>
+          <w:bCs w:val="0"/>
+          <w:noProof w:val="0"/>
+          <w:sz w:val="22"/>
+          <w:szCs w:val="22"/>
+          <w:lang w:val="es-ES"/>
+        </w:rPr>
+        <w:t>Clojure</w:t>
+      </w:r>
+      <w:r>
+        <w:rPr>
+          <w:rFonts w:ascii="Arial" w:hAnsi="Arial" w:eastAsia="Arial" w:cs="Arial"/>
+          <w:b w:val="0"/>
+          <w:bCs w:val="0"/>
+          <w:noProof w:val="0"/>
+          <w:sz w:val="22"/>
+          <w:szCs w:val="22"/>
+          <w:lang w:val="es-ES"/>
+        </w:rPr>
+        <w:t xml:space="preserve"> maneja el paso del tiempo mediante programación funcional y estructuras de datos persistentes. En lugar de modificar una variable que almacena el estado actual del semáforo, cada cálculo produce un nuevo valor a partir del tiempo recibido como entrada. Por ejemplo, la función obtiene el </w:t>
+      </w:r>
+      <w:r>
+        <w:rPr>
+          <w:rFonts w:ascii="Arial" w:hAnsi="Arial" w:eastAsia="Arial" w:cs="Arial"/>
+          <w:b w:val="0"/>
+          <w:bCs w:val="0"/>
+          <w:noProof w:val="0"/>
+          <w:sz w:val="22"/>
+          <w:szCs w:val="22"/>
+          <w:lang w:val="es-ES"/>
+        </w:rPr>
+        <w:t>timestamp</w:t>
+      </w:r>
+      <w:r>
+        <w:rPr>
+          <w:rFonts w:ascii="Arial" w:hAnsi="Arial" w:eastAsia="Arial" w:cs="Arial"/>
+          <w:b w:val="0"/>
+          <w:bCs w:val="0"/>
+          <w:noProof w:val="0"/>
+          <w:sz w:val="22"/>
+          <w:szCs w:val="22"/>
+          <w:lang w:val="es-ES"/>
+        </w:rPr>
+        <w:t xml:space="preserve"> actual, calcula la posición dentro del ciclo semafórico mediante una operación módulo y devuelve el estado correspondiente. De esta manera no existe una variable mutable que cambie de valor, cada ejecución genera un nuevo resultado a partir de los datos de entrada.</w:t>
+      </w:r>
+    </w:p>
+    <w:p>
+      <w:r>
+        <w:rPr>
+          <w:rFonts w:ascii="Arial" w:hAnsi="Arial" w:eastAsia="Arial" w:cs="Arial"/>
+          <w:b w:val="0"/>
+          <w:bCs w:val="0"/>
+          <w:noProof w:val="0"/>
+          <w:sz w:val="22"/>
+          <w:szCs w:val="22"/>
+          <w:lang w:val="es-ES"/>
+        </w:rPr>
+        <w:t>Sin embargo, esta característica no es exclusiva de Clojure. En nuestra implementación en Common Lisp también se adopta un enfoque funcional, ya que el estado del semáforo se calcula directamente a partir del timestamp recibido, sin modificar variables ni mantener un estado global mutable. La diferencia es que Clojure refuerza este estilo mediante la inmutabilidad por defecto y el uso de estructuras de datos persistentes, mientras que Common Lisp permite combinar tanto paradigmas funcionales como imperativos.</w:t>
+      </w:r>
+    </w:p>
+    <w:p>
+      <w:r>
+        <w:rPr>
+          <w:rFonts w:ascii="Arial" w:hAnsi="Arial" w:eastAsia="Arial" w:cs="Arial"/>
+          <w:b w:val="0"/>
+          <w:bCs w:val="0"/>
+          <w:noProof w:val="0"/>
+          <w:sz w:val="22"/>
+          <w:szCs w:val="22"/>
+          <w:lang w:val="es-ES"/>
+        </w:rPr>
+        <w:t xml:space="preserve">Fuente: </w:t>
+      </w:r>
+    </w:p>
+    <w:p>
+      <w:hyperlink r:id="Rc3d2238b234b4b6a">
+        <w:r>
+          <w:rPr>
+            <w:rStyle w:val="Hyperlink"/>
+            <w:b w:val="0"/>
+            <w:bCs w:val="0"/>
+            <w:noProof w:val="0"/>
+            <w:lang w:val="es-ES"/>
+          </w:rPr>
+          <w:t>Clojure Guide</w:t>
+        </w:r>
+        <w:r>
+          <w:rPr>
+            <w:rStyle w:val="Hyperlink"/>
+            <w:b w:val="0"/>
+            <w:bCs w:val="0"/>
+            <w:noProof w:val="0"/>
+            <w:lang w:val="es-ES"/>
+          </w:rPr>
+          <w:t xml:space="preserve"> -</w:t>
+        </w:r>
+        <w:r>
+          <w:rPr>
+            <w:rStyle w:val="Hyperlink"/>
+            <w:b w:val="0"/>
+            <w:bCs w:val="0"/>
+            <w:noProof w:val="0"/>
+            <w:lang w:val="es-ES"/>
+          </w:rPr>
+          <w:t xml:space="preserve">  Preguntas frecuentes</w:t>
+        </w:r>
+        <w:r>
+          <w:rPr>
+            <w:rStyle w:val="Hyperlink"/>
+            <w:b w:val="0"/>
+            <w:bCs w:val="0"/>
+            <w:noProof w:val="0"/>
+            <w:lang w:val="es-ES"/>
+          </w:rPr>
+          <w:t xml:space="preserve"> </w:t>
+        </w:r>
+        <w:r>
+          <w:rPr>
+            <w:rStyle w:val="Hyperlink"/>
+            <w:b w:val="0"/>
+            <w:bCs w:val="0"/>
+            <w:noProof w:val="0"/>
+            <w:lang w:val="es-ES"/>
+          </w:rPr>
+          <w:t xml:space="preserve"> </w:t>
+        </w:r>
+      </w:hyperlink>
+    </w:p>
+    <w:p>
+      <w:hyperlink r:id="R8df9d678e13143f6">
+        <w:r>
+          <w:rPr>
+            <w:rStyle w:val="Hyperlink"/>
+            <w:b w:val="0"/>
+            <w:bCs w:val="0"/>
+            <w:noProof w:val="0"/>
+            <w:lang w:val="es-ES"/>
+          </w:rPr>
+          <w:t>Learn Clojure</w:t>
+        </w:r>
+      </w:hyperlink>
+    </w:p>
+    <w:p>
+      <w:pPr>
+        <w:pStyle w:val="ListParagraph"/>
+        <w:spacing w:before="0" w:beforeAutospacing="off" w:after="0" w:afterAutospacing="off"/>
+        <w:ind w:left="720"/>
+        <w:rPr>
+          <w:rFonts w:ascii="Arial" w:hAnsi="Arial" w:eastAsia="Arial" w:cs="Arial"/>
+          <w:b w:val="0"/>
+          <w:bCs w:val="0"/>
+          <w:i w:val="0"/>
+          <w:iCs w:val="0"/>
+          <w:strike w:val="0"/>
+          <w:dstrike w:val="0"/>
+          <w:noProof w:val="0"/>
+          <w:color w:val="000000" w:themeColor="text1" w:themeTint="FF" w:themeShade="FF"/>
+          <w:sz w:val="22"/>
+          <w:szCs w:val="22"/>
+          <w:u w:val="none"/>
+          <w:lang w:val="es-ES"/>
+        </w:rPr>
+      </w:pPr>
     </w:p>
     <w:p>
       <w:pPr>
@@ -1706,6 +3495,126 @@
     </w:sectPr>
   </w:body>
 </w:document>
+</file>
+
+<file path=word/numbering.xml><?xml version="1.0" encoding="utf-8"?>
+<w:numbering xmlns:w="http://schemas.openxmlformats.org/wordprocessingml/2006/main">
+  <w:abstractNum xmlns:w="http://schemas.openxmlformats.org/wordprocessingml/2006/main" w:abstractNumId="1">
+    <w:nsid w:val="10e43d39"/>
+    <w:multiLevelType xmlns:w="http://schemas.openxmlformats.org/wordprocessingml/2006/main" w:val="hybridMultilevel"/>
+    <w:lvl xmlns:w="http://schemas.openxmlformats.org/wordprocessingml/2006/main" w:ilvl="0">
+      <w:start w:val="1"/>
+      <w:numFmt w:val="bullet"/>
+      <w:lvlText w:val=""/>
+      <w:lvlJc w:val="left"/>
+      <w:pPr>
+        <w:ind w:left="720" w:hanging="360"/>
+      </w:pPr>
+      <w:rPr>
+        <w:rFonts w:hint="default" w:ascii="Symbol" w:hAnsi="Symbol"/>
+      </w:rPr>
+    </w:lvl>
+    <w:lvl xmlns:w="http://schemas.openxmlformats.org/wordprocessingml/2006/main" w:ilvl="1">
+      <w:start w:val="1"/>
+      <w:numFmt w:val="bullet"/>
+      <w:lvlText w:val="o"/>
+      <w:lvlJc w:val="left"/>
+      <w:pPr>
+        <w:ind w:left="1440" w:hanging="360"/>
+      </w:pPr>
+      <w:rPr>
+        <w:rFonts w:hint="default" w:ascii="Courier New" w:hAnsi="Courier New"/>
+      </w:rPr>
+    </w:lvl>
+    <w:lvl xmlns:w="http://schemas.openxmlformats.org/wordprocessingml/2006/main" w:ilvl="2">
+      <w:start w:val="1"/>
+      <w:numFmt w:val="bullet"/>
+      <w:lvlText w:val=""/>
+      <w:lvlJc w:val="left"/>
+      <w:pPr>
+        <w:ind w:left="2160" w:hanging="360"/>
+      </w:pPr>
+      <w:rPr>
+        <w:rFonts w:hint="default" w:ascii="Wingdings" w:hAnsi="Wingdings"/>
+      </w:rPr>
+    </w:lvl>
+    <w:lvl xmlns:w="http://schemas.openxmlformats.org/wordprocessingml/2006/main" w:ilvl="3">
+      <w:start w:val="1"/>
+      <w:numFmt w:val="bullet"/>
+      <w:lvlText w:val=""/>
+      <w:lvlJc w:val="left"/>
+      <w:pPr>
+        <w:ind w:left="2880" w:hanging="360"/>
+      </w:pPr>
+      <w:rPr>
+        <w:rFonts w:hint="default" w:ascii="Symbol" w:hAnsi="Symbol"/>
+      </w:rPr>
+    </w:lvl>
+    <w:lvl xmlns:w="http://schemas.openxmlformats.org/wordprocessingml/2006/main" w:ilvl="4">
+      <w:start w:val="1"/>
+      <w:numFmt w:val="bullet"/>
+      <w:lvlText w:val="o"/>
+      <w:lvlJc w:val="left"/>
+      <w:pPr>
+        <w:ind w:left="3600" w:hanging="360"/>
+      </w:pPr>
+      <w:rPr>
+        <w:rFonts w:hint="default" w:ascii="Courier New" w:hAnsi="Courier New"/>
+      </w:rPr>
+    </w:lvl>
+    <w:lvl xmlns:w="http://schemas.openxmlformats.org/wordprocessingml/2006/main" w:ilvl="5">
+      <w:start w:val="1"/>
+      <w:numFmt w:val="bullet"/>
+      <w:lvlText w:val=""/>
+      <w:lvlJc w:val="left"/>
+      <w:pPr>
+        <w:ind w:left="4320" w:hanging="360"/>
+      </w:pPr>
+      <w:rPr>
+        <w:rFonts w:hint="default" w:ascii="Wingdings" w:hAnsi="Wingdings"/>
+      </w:rPr>
+    </w:lvl>
+    <w:lvl xmlns:w="http://schemas.openxmlformats.org/wordprocessingml/2006/main" w:ilvl="6">
+      <w:start w:val="1"/>
+      <w:numFmt w:val="bullet"/>
+      <w:lvlText w:val=""/>
+      <w:lvlJc w:val="left"/>
+      <w:pPr>
+        <w:ind w:left="5040" w:hanging="360"/>
+      </w:pPr>
+      <w:rPr>
+        <w:rFonts w:hint="default" w:ascii="Symbol" w:hAnsi="Symbol"/>
+      </w:rPr>
+    </w:lvl>
+    <w:lvl xmlns:w="http://schemas.openxmlformats.org/wordprocessingml/2006/main" w:ilvl="7">
+      <w:start w:val="1"/>
+      <w:numFmt w:val="bullet"/>
+      <w:lvlText w:val="o"/>
+      <w:lvlJc w:val="left"/>
+      <w:pPr>
+        <w:ind w:left="5760" w:hanging="360"/>
+      </w:pPr>
+      <w:rPr>
+        <w:rFonts w:hint="default" w:ascii="Courier New" w:hAnsi="Courier New"/>
+      </w:rPr>
+    </w:lvl>
+    <w:lvl xmlns:w="http://schemas.openxmlformats.org/wordprocessingml/2006/main" w:ilvl="8">
+      <w:start w:val="1"/>
+      <w:numFmt w:val="bullet"/>
+      <w:lvlText w:val=""/>
+      <w:lvlJc w:val="left"/>
+      <w:pPr>
+        <w:ind w:left="6480" w:hanging="360"/>
+      </w:pPr>
+      <w:rPr>
+        <w:rFonts w:hint="default" w:ascii="Wingdings" w:hAnsi="Wingdings"/>
+      </w:rPr>
+    </w:lvl>
+  </w:abstractNum>
+  <w:num w:numId="1">
+    <w:abstractNumId w:val="1"/>
+  </w:num>
+</w:numbering>
 </file>
 
 <file path=word/styles.xml><?xml version="1.0" encoding="utf-8"?>
@@ -2182,6 +4091,18 @@
       <w:outlineLvl w:val="3"/>
     </w:pPr>
   </w:style>
+  <w:style w:type="paragraph" w:styleId="ListParagraph">
+    <w:uiPriority w:val="34"/>
+    <w:name w:val="List Paragraph"/>
+    <w:basedOn w:val="Normal"/>
+    <w:qFormat/>
+    <w:rsid w:val="04A3E070"/>
+    <w:pPr>
+      <w:spacing/>
+      <w:ind w:left="720"/>
+      <w:contextualSpacing/>
+    </w:pPr>
+  </w:style>
 </w:styles>
 </file>
 

</xml_diff>